<commit_message>
El tall es mou al 16 de novembre; l Adria accepta GrossBuyPrice i explica les series
- Data nova (2 -> 16 de novembre) propagada al runbook, README, deploy/README,
  la Regla 04 i tres comentaris de codi.
- DB_FARINERA_PROD -> DB_FARINERA on encara hi era (la _PROD no existeix).
- resposta_adria_6 actualitzat i resposta_adria_7 afegit (tots dos enviats).
- memoria_projecte: respostes de l Adria del 14 i 15/10. Accepta GrossBuyPrice
  (falta el Lluis) i les set series que exclou, que a SAP encara no sabem com
  es distingiran.

Co-Authored-By: Claude Opus 5.5 <noreply@anthropic.com>
</commit_message>
<xml_diff>
--- a/resposta_adria_6.docx
+++ b/resposta_adria_6.docx
@@ -8,7 +8,7 @@
           <w:b w:val="0"/>
           <w:i w:val="0"/>
         </w:rPr>
-        <w:t>Hola Adrià, hola Lluís,</w:t>
+        <w:t>Hola Adrià,</w:t>
       </w:r>
     </w:p>
     <w:p>
@@ -51,24 +51,7 @@
           <w:b w:val="0"/>
           <w:i w:val="0"/>
         </w:rPr>
-        <w:t xml:space="preserve"> i les claus repetides queden tancats. Del </w:t>
-      </w:r>
-      <w:r>
-        <w:rPr>
-          <w:rFonts w:ascii="Consolas" w:hAnsi="Consolas"/>
-          <w:b w:val="0"/>
-          <w:i w:val="0"/>
-          <w:color w:val="333333"/>
-          <w:sz w:val="20"/>
-        </w:rPr>
-        <w:t>product_cost</w:t>
-      </w:r>
-      <w:r>
-        <w:rPr>
-          <w:b w:val="0"/>
-          <w:i w:val="0"/>
-        </w:rPr>
-        <w:t xml:space="preserve"> et contesto avall, però abans una cosa que surt del teu propi correu i que té data.</w:t>
+        <w:t xml:space="preserve"> i les claus repetides queden tancats. Tres coses.</w:t>
       </w:r>
     </w:p>
     <w:p>
@@ -80,7 +63,7 @@
           <w:b w:val="0"/>
           <w:i w:val="0"/>
         </w:rPr>
-        <w:t>El setembre i l'octubre es quedaran al 100 % de marge per sempre</w:t>
+        <w:t>1. El tall es mou del 2 al 16 de novembre</w:t>
       </w:r>
     </w:p>
     <w:p>
@@ -89,91 +72,52 @@
           <w:b w:val="0"/>
           <w:i w:val="0"/>
         </w:rPr>
-        <w:t xml:space="preserve">Al teu quadre de marges, </w:t>
+        <w:t xml:space="preserve">Està previst ara per </w:t>
       </w:r>
       <w:r>
         <w:rPr>
           <w:b/>
           <w:i w:val="0"/>
         </w:rPr>
-        <w:t>SET i OCT de 2026 surten al 100 %</w:t>
+        <w:t>dilluns 16 de novembre</w:t>
       </w:r>
       <w:r>
         <w:rPr>
           <w:b w:val="0"/>
           <w:i w:val="0"/>
         </w:rPr>
-        <w:t>: és el cost a zero que descrius. Fins ara això s'arreglava sol, perquè cada dia carregueu 90 dies i al canvi de mes el cost del mes -2 es recalcula i torna a entrar.</w:t>
+        <w:t xml:space="preserve">. Et toca dues coses: el filtre passa a </w:t>
       </w:r>
-    </w:p>
-    <w:p>
       <w:r>
         <w:rPr>
+          <w:rFonts w:ascii="Consolas" w:hAnsi="Consolas"/>
           <w:b/>
           <w:i w:val="0"/>
+          <w:color w:val="333333"/>
+          <w:sz w:val="20"/>
         </w:rPr>
-        <w:t>Això s'acaba el 2 de novembre.</w:t>
+        <w:t>date &gt;= '2026-11-16'</w:t>
       </w:r>
       <w:r>
         <w:rPr>
           <w:b w:val="0"/>
           <w:i w:val="0"/>
         </w:rPr>
-        <w:t xml:space="preserve"> La vostra càrrega nova filtra </w:t>
+        <w:t xml:space="preserve"> i </w:t>
       </w:r>
       <w:r>
         <w:rPr>
-          <w:rFonts w:ascii="Consolas" w:hAnsi="Consolas"/>
-          <w:b w:val="0"/>
+          <w:b/>
           <w:i w:val="0"/>
-          <w:color w:val="333333"/>
-          <w:sz w:val="20"/>
         </w:rPr>
-        <w:t>date &gt;= '2026-11-02'</w:t>
+        <w:t>el swap de les SQL es fa el dia 16</w:t>
       </w:r>
       <w:r>
         <w:rPr>
           <w:b w:val="0"/>
           <w:i w:val="0"/>
         </w:rPr>
-        <w:t xml:space="preserve">, així que a partir del tall no tornareu a llegir cap línia anterior i </w:t>
-      </w:r>
-      <w:r>
-        <w:rPr>
-          <w:b/>
-          <w:i w:val="0"/>
-        </w:rPr>
-        <w:t>la correcció del setembre i de l'octubre no arribarà mai</w:t>
-      </w:r>
-      <w:r>
-        <w:rPr>
-          <w:b w:val="0"/>
-          <w:i w:val="0"/>
-        </w:rPr>
-        <w:t>. Pel vostre propi mecanisme, el setembre no es recalcula fins a l'1 de novembre —un dia abans— i l'octubre no ho faria fins al desembre, que ja no existirà per a vosaltres.</w:t>
-      </w:r>
-    </w:p>
-    <w:p>
-      <w:r>
-        <w:rPr>
-          <w:b w:val="0"/>
-          <w:i w:val="0"/>
-        </w:rPr>
-        <w:t xml:space="preserve">O sigui que </w:t>
-      </w:r>
-      <w:r>
-        <w:rPr>
-          <w:b/>
-          <w:i w:val="0"/>
-        </w:rPr>
-        <w:t>l'última càrrega des de KAIS abans del tall és l'última oportunitat</w:t>
-      </w:r>
-      <w:r>
-        <w:rPr>
-          <w:b w:val="0"/>
-          <w:i w:val="0"/>
-        </w:rPr>
-        <w:t xml:space="preserve"> de deixar aquells dos mesos bé. Si no, el quadre de marges queda amb dos mesos al 100 % de manera permanent i d'aquí a sis mesos ningú recordarà per què.</w:t>
+        <w:t>. La nit de relleu segueix sent diumenge → dilluns (KAIS fins al 15, SAP des del 16), o sigui que no hi ha cap dia amb insercions a les dues bases, que era el que em preguntaves l'1 de setembre.</w:t>
       </w:r>
     </w:p>
     <w:p>
@@ -185,7 +129,7 @@
           <w:b w:val="0"/>
           <w:i w:val="0"/>
         </w:rPr>
-        <w:t>El cost: he mirat tot el que dona SAP, i no hi ha el camp que teníeu</w:t>
+        <w:t>2. Això salva el setembre; l'octubre i el novembre els has de corregir tu</w:t>
       </w:r>
     </w:p>
     <w:p>
@@ -194,21 +138,7 @@
           <w:b w:val="0"/>
           <w:i w:val="0"/>
         </w:rPr>
-        <w:t xml:space="preserve">He llegit la llista sencera de camps de preu i cost que Service Layer dona a una línia d'albarà. </w:t>
-      </w:r>
-      <w:r>
-        <w:rPr>
-          <w:b/>
-          <w:i w:val="0"/>
-        </w:rPr>
-        <w:t>El cost congelat al moment de l'albarà —el que us arribava de KAIS— no hi és.</w:t>
-      </w:r>
-      <w:r>
-        <w:rPr>
-          <w:b w:val="0"/>
-          <w:i w:val="0"/>
-        </w:rPr>
-        <w:t xml:space="preserve"> Dels quatre candidats, mesurats contra les dades que us enviàvem abans:</w:t>
+        <w:t>El 100 % de marge de SET i OCT és el cost a zero, que fins ara s'arreglava sol perquè al canvi de mes el cost del mes −2 torna a entrar amb els 90 dies. Amb la data nova:</w:t>
       </w:r>
     </w:p>
     <w:tbl>
@@ -218,13 +148,14 @@
         <w:tblLook w:firstColumn="1" w:firstRow="1" w:lastColumn="0" w:lastRow="0" w:noHBand="0" w:noVBand="1" w:val="04A0"/>
       </w:tblPr>
       <w:tblGrid>
-        <w:gridCol w:w="4320"/>
-        <w:gridCol w:w="4320"/>
+        <w:gridCol w:w="2880"/>
+        <w:gridCol w:w="2880"/>
+        <w:gridCol w:w="2880"/>
       </w:tblGrid>
       <w:tr>
         <w:tc>
           <w:tcPr>
-            <w:tcW w:type="dxa" w:w="4320"/>
+            <w:tcW w:type="dxa" w:w="2880"/>
           </w:tcPr>
           <w:p>
             <w:r>
@@ -232,13 +163,13 @@
                 <w:b/>
                 <w:i w:val="0"/>
               </w:rPr>
-              <w:t>Camp</w:t>
+              <w:t>Mes</w:t>
             </w:r>
           </w:p>
         </w:tc>
         <w:tc>
           <w:tcPr>
-            <w:tcW w:type="dxa" w:w="4320"/>
+            <w:tcW w:type="dxa" w:w="2880"/>
           </w:tcPr>
           <w:p>
             <w:r>
@@ -246,7 +177,21 @@
                 <w:b/>
                 <w:i w:val="0"/>
               </w:rPr>
-              <w:t>Quadra amb el cost que teníeu</w:t>
+              <w:t>El cost li entra a KAIS</w:t>
+            </w:r>
+          </w:p>
+        </w:tc>
+        <w:tc>
+          <w:tcPr>
+            <w:tcW w:type="dxa" w:w="2880"/>
+          </w:tcPr>
+          <w:p>
+            <w:r>
+              <w:rPr>
+                <w:b/>
+                <w:i w:val="0"/>
+              </w:rPr>
+              <w:t>Amb el tall el 16/11</w:t>
             </w:r>
           </w:p>
         </w:tc>
@@ -254,24 +199,7 @@
       <w:tr>
         <w:tc>
           <w:tcPr>
-            <w:tcW w:type="dxa" w:w="4320"/>
-          </w:tcPr>
-          <w:p>
-            <w:r>
-              <w:rPr>
-                <w:rFonts w:ascii="Consolas" w:hAnsi="Consolas"/>
-                <w:b w:val="0"/>
-                <w:i w:val="0"/>
-                <w:color w:val="333333"/>
-                <w:sz w:val="20"/>
-              </w:rPr>
-              <w:t>StockInmPrice</w:t>
-            </w:r>
-          </w:p>
-        </w:tc>
-        <w:tc>
-          <w:tcPr>
-            <w:tcW w:type="dxa" w:w="4320"/>
+            <w:tcW w:type="dxa" w:w="2880"/>
           </w:tcPr>
           <w:p>
             <w:r>
@@ -279,7 +207,49 @@
                 <w:b w:val="0"/>
                 <w:i w:val="0"/>
               </w:rPr>
-              <w:t>0 %</w:t>
+              <w:t>Setembre 2026</w:t>
+            </w:r>
+          </w:p>
+        </w:tc>
+        <w:tc>
+          <w:tcPr>
+            <w:tcW w:type="dxa" w:w="2880"/>
+          </w:tcPr>
+          <w:p>
+            <w:r>
+              <w:rPr>
+                <w:b w:val="0"/>
+                <w:i w:val="0"/>
+              </w:rPr>
+              <w:t>l'1 de novembre</w:t>
+            </w:r>
+          </w:p>
+        </w:tc>
+        <w:tc>
+          <w:tcPr>
+            <w:tcW w:type="dxa" w:w="2880"/>
+          </w:tcPr>
+          <w:p>
+            <w:r>
+              <w:rPr>
+                <w:b w:val="0"/>
+                <w:i w:val="0"/>
+              </w:rPr>
+              <w:t xml:space="preserve">✅ </w:t>
+            </w:r>
+            <w:r>
+              <w:rPr>
+                <w:b/>
+                <w:i w:val="0"/>
+              </w:rPr>
+              <w:t>entra sol</w:t>
+            </w:r>
+            <w:r>
+              <w:rPr>
+                <w:b w:val="0"/>
+                <w:i w:val="0"/>
+              </w:rPr>
+              <w:t>, dues setmanes abans del tall</w:t>
             </w:r>
           </w:p>
         </w:tc>
@@ -287,24 +257,7 @@
       <w:tr>
         <w:tc>
           <w:tcPr>
-            <w:tcW w:type="dxa" w:w="4320"/>
-          </w:tcPr>
-          <w:p>
-            <w:r>
-              <w:rPr>
-                <w:rFonts w:ascii="Consolas" w:hAnsi="Consolas"/>
-                <w:b w:val="0"/>
-                <w:i w:val="0"/>
-                <w:color w:val="333333"/>
-                <w:sz w:val="20"/>
-              </w:rPr>
-              <w:t>LastBuyInmPrice</w:t>
-            </w:r>
-          </w:p>
-        </w:tc>
-        <w:tc>
-          <w:tcPr>
-            <w:tcW w:type="dxa" w:w="4320"/>
+            <w:tcW w:type="dxa" w:w="2880"/>
           </w:tcPr>
           <w:p>
             <w:r>
@@ -312,7 +265,35 @@
                 <w:b w:val="0"/>
                 <w:i w:val="0"/>
               </w:rPr>
-              <w:t>0 % — sempre val zero</w:t>
+              <w:t>Octubre 2026</w:t>
+            </w:r>
+          </w:p>
+        </w:tc>
+        <w:tc>
+          <w:tcPr>
+            <w:tcW w:type="dxa" w:w="2880"/>
+          </w:tcPr>
+          <w:p>
+            <w:r>
+              <w:rPr>
+                <w:b w:val="0"/>
+                <w:i w:val="0"/>
+              </w:rPr>
+              <w:t>l'1 de desembre</w:t>
+            </w:r>
+          </w:p>
+        </w:tc>
+        <w:tc>
+          <w:tcPr>
+            <w:tcW w:type="dxa" w:w="2880"/>
+          </w:tcPr>
+          <w:p>
+            <w:r>
+              <w:rPr>
+                <w:b w:val="0"/>
+                <w:i w:val="0"/>
+              </w:rPr>
+              <w:t>❌ ja no llegireu KAIS</w:t>
             </w:r>
           </w:p>
         </w:tc>
@@ -320,24 +301,7 @@
       <w:tr>
         <w:tc>
           <w:tcPr>
-            <w:tcW w:type="dxa" w:w="4320"/>
-          </w:tcPr>
-          <w:p>
-            <w:r>
-              <w:rPr>
-                <w:rFonts w:ascii="Consolas" w:hAnsi="Consolas"/>
-                <w:b w:val="0"/>
-                <w:i w:val="0"/>
-                <w:color w:val="333333"/>
-                <w:sz w:val="20"/>
-              </w:rPr>
-              <w:t>GrossProfitTotalBasePrice</w:t>
-            </w:r>
-          </w:p>
-        </w:tc>
-        <w:tc>
-          <w:tcPr>
-            <w:tcW w:type="dxa" w:w="4320"/>
+            <w:tcW w:type="dxa" w:w="2880"/>
           </w:tcPr>
           <w:p>
             <w:r>
@@ -345,61 +309,35 @@
                 <w:b w:val="0"/>
                 <w:i w:val="0"/>
               </w:rPr>
-              <w:t xml:space="preserve">és un </w:t>
+              <w:t>1–15 de novembre</w:t>
             </w:r>
-            <w:r>
-              <w:rPr>
-                <w:b/>
-                <w:i w:val="0"/>
-              </w:rPr>
-              <w:t>total de línia</w:t>
-            </w:r>
+          </w:p>
+        </w:tc>
+        <w:tc>
+          <w:tcPr>
+            <w:tcW w:type="dxa" w:w="2880"/>
+          </w:tcPr>
+          <w:p>
             <w:r>
               <w:rPr>
                 <w:b w:val="0"/>
                 <w:i w:val="0"/>
               </w:rPr>
-              <w:t>, no un preu unitari</w:t>
+              <w:t>l'1 de gener</w:t>
             </w:r>
           </w:p>
         </w:tc>
-      </w:tr>
-      <w:tr>
         <w:tc>
           <w:tcPr>
-            <w:tcW w:type="dxa" w:w="4320"/>
+            <w:tcW w:type="dxa" w:w="2880"/>
           </w:tcPr>
           <w:p>
-            <w:r>
-              <w:rPr>
-                <w:rFonts w:ascii="Consolas" w:hAnsi="Consolas"/>
-                <w:b/>
-                <w:i w:val="0"/>
-                <w:color w:val="333333"/>
-                <w:sz w:val="20"/>
-              </w:rPr>
-              <w:t>GrossBuyPrice</w:t>
-            </w:r>
             <w:r>
               <w:rPr>
                 <w:b w:val="0"/>
                 <w:i w:val="0"/>
               </w:rPr>
-              <w:t xml:space="preserve"> (preu de compra)</w:t>
-            </w:r>
-          </w:p>
-        </w:tc>
-        <w:tc>
-          <w:tcPr>
-            <w:tcW w:type="dxa" w:w="4320"/>
-          </w:tcPr>
-          <w:p>
-            <w:r>
-              <w:rPr>
-                <w:b/>
-                <w:i w:val="0"/>
-              </w:rPr>
-              <w:t>87 %</w:t>
+              <w:t>❌ ja no llegireu KAIS</w:t>
             </w:r>
           </w:p>
         </w:tc>
@@ -412,7 +350,98 @@
           <w:b w:val="0"/>
           <w:i w:val="0"/>
         </w:rPr>
-        <w:t xml:space="preserve">Així que sí, </w:t>
+        <w:t xml:space="preserve">Del setembre, doncs, només cal que comprovis l'1 o el 2 de novembre que ha entrat amb cost. </w:t>
+      </w:r>
+      <w:r>
+        <w:rPr>
+          <w:b/>
+          <w:i w:val="0"/>
+        </w:rPr>
+        <w:t>Els altres dos no els salva cap càrrega d'abans del tall</w:t>
+      </w:r>
+      <w:r>
+        <w:rPr>
+          <w:b w:val="0"/>
+          <w:i w:val="0"/>
+        </w:rPr>
+        <w:t xml:space="preserve">: el dia 15 el seu cost encara no existeix. La via és la que ja vas proposar l'1 de setembre —corregir-ho amb una càrrega puntual de KAIS, que queda viu per consulta—, amb dues precisions: </w:t>
+      </w:r>
+      <w:r>
+        <w:rPr>
+          <w:b/>
+          <w:i w:val="0"/>
+        </w:rPr>
+        <w:t>no n'hi ha prou amb el desembre</w:t>
+      </w:r>
+      <w:r>
+        <w:rPr>
+          <w:b w:val="0"/>
+          <w:i w:val="0"/>
+        </w:rPr>
+        <w:t xml:space="preserve">, perquè l'1–15 de novembre no tanca fins a l'1 de gener (o dues càrregues, o una de sola al gener amb data mínima l'1 d'octubre); i ⚠️ </w:t>
+      </w:r>
+      <w:r>
+        <w:rPr>
+          <w:b/>
+          <w:i w:val="0"/>
+        </w:rPr>
+        <w:t>em vas dir que la càrrega «reemplaça a partir de la data mínima»</w:t>
+      </w:r>
+      <w:r>
+        <w:rPr>
+          <w:b w:val="0"/>
+          <w:i w:val="0"/>
+        </w:rPr>
+        <w:t xml:space="preserve"> — si és així, una càrrega amb data mínima l'1 d'octubre que només porti KAIS </w:t>
+      </w:r>
+      <w:r>
+        <w:rPr>
+          <w:b/>
+          <w:i w:val="0"/>
+        </w:rPr>
+        <w:t>s'enduria el que ja hi haurà de SAP del 16 endavant?</w:t>
+      </w:r>
+      <w:r>
+        <w:rPr>
+          <w:b w:val="0"/>
+          <w:i w:val="0"/>
+        </w:rPr>
+        <w:t xml:space="preserve"> T'ho deixo com a pregunta perquè és del tipus que no es veu: no quedarien dades dolentes, no quedarien.</w:t>
+      </w:r>
+    </w:p>
+    <w:p>
+      <w:pPr>
+        <w:pStyle w:val="Heading2"/>
+      </w:pPr>
+      <w:r>
+        <w:rPr>
+          <w:b w:val="0"/>
+          <w:i w:val="0"/>
+        </w:rPr>
+        <w:t>3. El cost: SAP no té el camp que teníeu</w:t>
+      </w:r>
+    </w:p>
+    <w:p>
+      <w:r>
+        <w:rPr>
+          <w:b w:val="0"/>
+          <w:i w:val="0"/>
+        </w:rPr>
+        <w:t xml:space="preserve">He llegit la llista sencera de camps de preu i cost que Service Layer dona a una línia d'albarà, i </w:t>
+      </w:r>
+      <w:r>
+        <w:rPr>
+          <w:b/>
+          <w:i w:val="0"/>
+        </w:rPr>
+        <w:t>el cost congelat al moment de l'albarà no hi és</w:t>
+      </w:r>
+      <w:r>
+        <w:rPr>
+          <w:b w:val="0"/>
+          <w:i w:val="0"/>
+        </w:rPr>
+        <w:t xml:space="preserve">. Mesurats contra el que us enviàvem: </w:t>
       </w:r>
       <w:r>
         <w:rPr>
@@ -422,85 +451,100 @@
           <w:color w:val="333333"/>
           <w:sz w:val="20"/>
         </w:rPr>
-        <w:t>GrossBuyPrice</w:t>
+        <w:t>StockInmPrice</w:t>
       </w:r>
       <w:r>
         <w:rPr>
           <w:b w:val="0"/>
           <w:i w:val="0"/>
         </w:rPr>
-        <w:t xml:space="preserve"> és l'únic candidat real, i és el que has vist en altres clients. </w:t>
+        <w:t xml:space="preserve"> 0 %, </w:t>
+      </w:r>
+      <w:r>
+        <w:rPr>
+          <w:rFonts w:ascii="Consolas" w:hAnsi="Consolas"/>
+          <w:b w:val="0"/>
+          <w:i w:val="0"/>
+          <w:color w:val="333333"/>
+          <w:sz w:val="20"/>
+        </w:rPr>
+        <w:t>LastBuyInmPrice</w:t>
+      </w:r>
+      <w:r>
+        <w:rPr>
+          <w:b w:val="0"/>
+          <w:i w:val="0"/>
+        </w:rPr>
+        <w:t xml:space="preserve"> sempre zero, </w:t>
+      </w:r>
+      <w:r>
+        <w:rPr>
+          <w:rFonts w:ascii="Consolas" w:hAnsi="Consolas"/>
+          <w:b w:val="0"/>
+          <w:i w:val="0"/>
+          <w:color w:val="333333"/>
+          <w:sz w:val="20"/>
+        </w:rPr>
+        <w:t>GrossProfitTotalBasePrice</w:t>
+      </w:r>
+      <w:r>
+        <w:rPr>
+          <w:b w:val="0"/>
+          <w:i w:val="0"/>
+        </w:rPr>
+        <w:t xml:space="preserve"> és un total de línia i no un preu unitari, i </w:t>
+      </w:r>
+      <w:r>
+        <w:rPr>
+          <w:rFonts w:ascii="Consolas" w:hAnsi="Consolas"/>
+          <w:b/>
+          <w:i w:val="0"/>
+          <w:color w:val="333333"/>
+          <w:sz w:val="20"/>
+        </w:rPr>
+        <w:t>GrossBuyPrice</w:t>
       </w:r>
       <w:r>
         <w:rPr>
           <w:b/>
           <w:i w:val="0"/>
         </w:rPr>
-        <w:t>Però porta un canvi de significat que heu de saber abans de decidir:</w:t>
-      </w:r>
-    </w:p>
-    <w:p>
-      <w:pPr>
-        <w:pStyle w:val="ListBullet"/>
-      </w:pPr>
-      <w:r>
-        <w:rPr>
-          <w:b/>
-          <w:i w:val="0"/>
-        </w:rPr>
-        <w:t>No és el cost del dia de l'albarà, és el preu de compra actual de l'article.</w:t>
+        <w:t xml:space="preserve"> el 87 %</w:t>
       </w:r>
       <w:r>
         <w:rPr>
           <w:b w:val="0"/>
           <w:i w:val="0"/>
         </w:rPr>
-        <w:t xml:space="preserve"> Per això quadra el 87 % i no el 100 %: coincideix amb els articles que no han mogut el preu des de l'albarà.</w:t>
+        <w:t xml:space="preserve">. Així que sí, és l'únic candidat real i és el que has vist en altres clients, però canvia de significat: </w:t>
       </w:r>
-    </w:p>
-    <w:p>
-      <w:pPr>
-        <w:pStyle w:val="ListBullet"/>
-      </w:pPr>
       <w:r>
         <w:rPr>
           <w:b/>
           <w:i w:val="0"/>
         </w:rPr>
-        <w:t>No s'autocorregeix al cap de dos mesos.</w:t>
+        <w:t>és el preu de compra actual de l'article, no el cost del dia de l'albarà</w:t>
       </w:r>
       <w:r>
         <w:rPr>
           <w:b w:val="0"/>
           <w:i w:val="0"/>
         </w:rPr>
-        <w:t xml:space="preserve"> No arriba tard: arriba sempre d'avui. El comportament que coneixeu desapareix, posem el que posem.</w:t>
-      </w:r>
-    </w:p>
-    <w:p>
-      <w:pPr>
-        <w:pStyle w:val="ListBullet"/>
-      </w:pPr>
-      <w:r>
-        <w:rPr>
-          <w:b w:val="0"/>
-          <w:i w:val="0"/>
-        </w:rPr>
-        <w:t xml:space="preserve">Si l'adoptem, el </w:t>
+        <w:t xml:space="preserve"> —per això fa 87 % i no 100 %—, i </w:t>
       </w:r>
       <w:r>
         <w:rPr>
           <w:b/>
           <w:i w:val="0"/>
         </w:rPr>
-        <w:t>congelem nosaltres a la primera càrrega</w:t>
+        <w:t>ja no s'autocorregeix</w:t>
       </w:r>
       <w:r>
         <w:rPr>
           <w:b w:val="0"/>
           <w:i w:val="0"/>
         </w:rPr>
-        <w:t xml:space="preserve"> de cada línia. Si no, la nostra reconstrucció setmanal el reescriuria amb el preu d'aquell dia i els vostres marges històrics anirien canviant sols.</w:t>
+        <w:t xml:space="preserve"> al cap de dos mesos. Si l'adoptem, el congelem nosaltres a la primera càrrega; si no, la nostra reconstrucció setmanal us aniria canviant els marges històrics sols.</w:t>
       </w:r>
     </w:p>
     <w:p>
@@ -509,14 +553,14 @@
           <w:b/>
           <w:i w:val="0"/>
         </w:rPr>
-        <w:t>Lluís, la pregunta és teva i és una sola:</w:t>
+        <w:t>Com ho fan els clients on l'has vist?</w:t>
       </w:r>
       <w:r>
         <w:rPr>
           <w:b w:val="0"/>
           <w:i w:val="0"/>
         </w:rPr>
-        <w:t xml:space="preserve"> et serveix «el preu de compra de l'article el dia que l'albarà entra al sistema», sabent que no és exactament el cost d'abans? Si et serveix, ho munto i queda congelat. Si no, el deixem a zero i no ensenyem un marge que no és.</w:t>
+        <w:t xml:space="preserve"> Ho pregunto perquè tu saps què hi fa l'anàlisi de marges amb aquest camp i jo no: donar-vos el preu de compra congelat al primer dia que veiem la línia és millor que un zero, o és pitjor que un zero perquè sembla un cost i no ho és? Amb el que em diguis ho tanco amb el Lluís, que és qui mira els marges, i et confirmo què hi posem.</w:t>
       </w:r>
     </w:p>
     <w:p>

</xml_diff>